<commit_message>
Improve DocuMind RAG and UI
</commit_message>
<xml_diff>
--- a/report.docx
+++ b/report.docx
@@ -4,6 +4,81 @@
   <w:body>
     <w:p>
       <w:r>
+        <w:t>I do</w:t>
+      </w:r>
+      <w:r>
+        <w:t xml:space="preserve"> </w:t>
+      </w:r>
+      <w:r>
+        <w:t xml:space="preserve">not need </w:t>
+      </w:r>
+      <w:r>
+        <w:t xml:space="preserve">SWAGS, but </w:t>
+      </w:r>
+      <w:r>
+        <w:t xml:space="preserve">since </w:t>
+      </w:r>
+      <w:r>
+        <w:t>I</w:t>
+      </w:r>
+      <w:r>
+        <w:t xml:space="preserve"> have to mandatorily attach</w:t>
+      </w:r>
+      <w:r>
+        <w:t xml:space="preserve"> a screenshot for the</w:t>
+      </w:r>
+      <w:r>
+        <w:t xml:space="preserve"> proof of payment</w:t>
+      </w:r>
+      <w:r>
+        <w:t>. I am keeping this screenshot to let u know that</w:t>
+      </w:r>
+      <w:r>
+        <w:t xml:space="preserve"> </w:t>
+      </w:r>
+      <w:r>
+        <w:t>I</w:t>
+      </w:r>
+      <w:r>
+        <w:t xml:space="preserve"> do</w:t>
+      </w:r>
+      <w:r>
+        <w:t xml:space="preserve"> </w:t>
+      </w:r>
+      <w:r>
+        <w:t>not want swags</w:t>
+      </w:r>
+      <w:r>
+        <w:t>,</w:t>
+      </w:r>
+      <w:r>
+        <w:t xml:space="preserve"> so</w:t>
+      </w:r>
+      <w:r>
+        <w:t xml:space="preserve"> I </w:t>
+      </w:r>
+      <w:r>
+        <w:t>did</w:t>
+      </w:r>
+      <w:r>
+        <w:t xml:space="preserve"> </w:t>
+      </w:r>
+      <w:r>
+        <w:t xml:space="preserve">not </w:t>
+      </w:r>
+      <w:r>
+        <w:t>make</w:t>
+      </w:r>
+      <w:r>
+        <w:t xml:space="preserve"> the payment</w:t>
+      </w:r>
+      <w:r>
+        <w:t>.</w:t>
+      </w:r>
+    </w:p>
+    <w:p/>
+    <w:p>
+      <w:r>
         <w:t xml:space="preserve">Absolutely. This is actually a </w:t>
       </w:r>
       <w:r>
@@ -211,6 +286,7 @@
           <w:b/>
           <w:bCs/>
         </w:rPr>
+        <w:lastRenderedPageBreak/>
         <w:t>3. Added document text extraction</w:t>
       </w:r>
     </w:p>
@@ -231,7 +307,6 @@
     </w:p>
     <w:p>
       <w:r>
-        <w:lastRenderedPageBreak/>
         <w:t>PDF/TXT</w:t>
       </w:r>
     </w:p>
@@ -422,6 +497,7 @@
     </w:p>
     <w:p>
       <w:r>
+        <w:lastRenderedPageBreak/>
         <w:t xml:space="preserve"> │   ...    │</w:t>
       </w:r>
     </w:p>
@@ -442,7 +518,6 @@
     </w:p>
     <w:p>
       <w:r>
-        <w:lastRenderedPageBreak/>
         <w:t>Our initial strategy was approximately:</w:t>
       </w:r>
     </w:p>
@@ -589,6 +664,7 @@
     </w:p>
     <w:p>
       <w:r>
+        <w:lastRenderedPageBreak/>
         <w:t>Emb edding</w:t>
       </w:r>
     </w:p>
@@ -640,7 +716,6 @@
         </w:numPr>
       </w:pPr>
       <w:r>
-        <w:lastRenderedPageBreak/>
         <w:t>preserve useful line breaks</w:t>
       </w:r>
     </w:p>
@@ -821,6 +896,7 @@
     </w:p>
     <w:p>
       <w:r>
+        <w:lastRenderedPageBreak/>
         <w:t xml:space="preserve">                      │</w:t>
       </w:r>
     </w:p>
@@ -847,175 +923,175 @@
     </w:p>
     <w:p>
       <w:r>
+        <w:t xml:space="preserve">                      </w:t>
+      </w:r>
+      <w:r>
+        <w:rPr>
+          <w:rFonts w:ascii="Arial" w:hAnsi="Arial" w:cs="Arial"/>
+        </w:rPr>
+        <w:t>▼</w:t>
+      </w:r>
+    </w:p>
+    <w:p>
+      <w:r>
+        <w:t xml:space="preserve">                Store vectors</w:t>
+      </w:r>
+    </w:p>
+    <w:p>
+      <w:r>
+        <w:t xml:space="preserve">                      │</w:t>
+      </w:r>
+    </w:p>
+    <w:p>
+      <w:r>
+        <w:t xml:space="preserve">                      </w:t>
+      </w:r>
+      <w:r>
+        <w:rPr>
+          <w:rFonts w:ascii="Arial" w:hAnsi="Arial" w:cs="Arial"/>
+        </w:rPr>
+        <w:t>▼</w:t>
+      </w:r>
+    </w:p>
+    <w:p>
+      <w:r>
+        <w:t xml:space="preserve">              User asks a question</w:t>
+      </w:r>
+    </w:p>
+    <w:p>
+      <w:r>
+        <w:t xml:space="preserve">                      │</w:t>
+      </w:r>
+    </w:p>
+    <w:p>
+      <w:r>
+        <w:t xml:space="preserve">                      </w:t>
+      </w:r>
+      <w:r>
+        <w:rPr>
+          <w:rFonts w:ascii="Arial" w:hAnsi="Arial" w:cs="Arial"/>
+        </w:rPr>
+        <w:t>▼</w:t>
+      </w:r>
+    </w:p>
+    <w:p>
+      <w:r>
+        <w:t xml:space="preserve">          Embed the user's question</w:t>
+      </w:r>
+    </w:p>
+    <w:p>
+      <w:r>
+        <w:t xml:space="preserve">                      │</w:t>
+      </w:r>
+    </w:p>
+    <w:p>
+      <w:r>
+        <w:t xml:space="preserve">                      </w:t>
+      </w:r>
+      <w:r>
+        <w:rPr>
+          <w:rFonts w:ascii="Arial" w:hAnsi="Arial" w:cs="Arial"/>
+        </w:rPr>
+        <w:t>▼</w:t>
+      </w:r>
+    </w:p>
+    <w:p>
+      <w:r>
+        <w:t xml:space="preserve">             Similarity search</w:t>
+      </w:r>
+    </w:p>
+    <w:p>
+      <w:r>
+        <w:t xml:space="preserve">                      │</w:t>
+      </w:r>
+    </w:p>
+    <w:p>
+      <w:r>
+        <w:t xml:space="preserve">                      </w:t>
+      </w:r>
+      <w:r>
+        <w:rPr>
+          <w:rFonts w:ascii="Arial" w:hAnsi="Arial" w:cs="Arial"/>
+        </w:rPr>
+        <w:t>▼</w:t>
+      </w:r>
+    </w:p>
+    <w:p>
+      <w:r>
+        <w:t xml:space="preserve">          Retrieve relevant chunks</w:t>
+      </w:r>
+    </w:p>
+    <w:p>
+      <w:r>
+        <w:t xml:space="preserve">                      │</w:t>
+      </w:r>
+    </w:p>
+    <w:p>
+      <w:r>
+        <w:t xml:space="preserve">                      </w:t>
+      </w:r>
+      <w:r>
+        <w:rPr>
+          <w:rFonts w:ascii="Arial" w:hAnsi="Arial" w:cs="Arial"/>
+        </w:rPr>
+        <w:t>▼</w:t>
+      </w:r>
+    </w:p>
+    <w:p>
+      <w:r>
+        <w:t xml:space="preserve">              Send context + query</w:t>
+      </w:r>
+    </w:p>
+    <w:p>
+      <w:r>
+        <w:t xml:space="preserve">                    to LLM</w:t>
+      </w:r>
+    </w:p>
+    <w:p>
+      <w:r>
+        <w:t xml:space="preserve">                      │</w:t>
+      </w:r>
+    </w:p>
+    <w:p>
+      <w:r>
+        <w:t xml:space="preserve">                      </w:t>
+      </w:r>
+      <w:r>
+        <w:rPr>
+          <w:rFonts w:ascii="Arial" w:hAnsi="Arial" w:cs="Arial"/>
+        </w:rPr>
+        <w:t>▼</w:t>
+      </w:r>
+    </w:p>
+    <w:p>
+      <w:r>
+        <w:t xml:space="preserve">              Grounded AI answer</w:t>
+      </w:r>
+    </w:p>
+    <w:p>
+      <w:r>
+        <w:t xml:space="preserve">                      │</w:t>
+      </w:r>
+    </w:p>
+    <w:p>
+      <w:r>
+        <w:t xml:space="preserve">                      </w:t>
+      </w:r>
+      <w:r>
+        <w:rPr>
+          <w:rFonts w:ascii="Arial" w:hAnsi="Arial" w:cs="Arial"/>
+        </w:rPr>
+        <w:t>▼</w:t>
+      </w:r>
+    </w:p>
+    <w:p>
+      <w:r>
+        <w:t xml:space="preserve">             Show source context</w:t>
+      </w:r>
+    </w:p>
+    <w:p>
+      <w:r>
         <w:lastRenderedPageBreak/>
-        <w:t xml:space="preserve">                      </w:t>
-      </w:r>
-      <w:r>
-        <w:rPr>
-          <w:rFonts w:ascii="Arial" w:hAnsi="Arial" w:cs="Arial"/>
-        </w:rPr>
-        <w:t>▼</w:t>
-      </w:r>
-    </w:p>
-    <w:p>
-      <w:r>
-        <w:t xml:space="preserve">                Store vectors</w:t>
-      </w:r>
-    </w:p>
-    <w:p>
-      <w:r>
-        <w:t xml:space="preserve">                      │</w:t>
-      </w:r>
-    </w:p>
-    <w:p>
-      <w:r>
-        <w:t xml:space="preserve">                      </w:t>
-      </w:r>
-      <w:r>
-        <w:rPr>
-          <w:rFonts w:ascii="Arial" w:hAnsi="Arial" w:cs="Arial"/>
-        </w:rPr>
-        <w:t>▼</w:t>
-      </w:r>
-    </w:p>
-    <w:p>
-      <w:r>
-        <w:t xml:space="preserve">              User asks a question</w:t>
-      </w:r>
-    </w:p>
-    <w:p>
-      <w:r>
-        <w:t xml:space="preserve">                      │</w:t>
-      </w:r>
-    </w:p>
-    <w:p>
-      <w:r>
-        <w:t xml:space="preserve">                      </w:t>
-      </w:r>
-      <w:r>
-        <w:rPr>
-          <w:rFonts w:ascii="Arial" w:hAnsi="Arial" w:cs="Arial"/>
-        </w:rPr>
-        <w:t>▼</w:t>
-      </w:r>
-    </w:p>
-    <w:p>
-      <w:r>
-        <w:t xml:space="preserve">          Embed the user's question</w:t>
-      </w:r>
-    </w:p>
-    <w:p>
-      <w:r>
-        <w:t xml:space="preserve">                      │</w:t>
-      </w:r>
-    </w:p>
-    <w:p>
-      <w:r>
-        <w:t xml:space="preserve">                      </w:t>
-      </w:r>
-      <w:r>
-        <w:rPr>
-          <w:rFonts w:ascii="Arial" w:hAnsi="Arial" w:cs="Arial"/>
-        </w:rPr>
-        <w:t>▼</w:t>
-      </w:r>
-    </w:p>
-    <w:p>
-      <w:r>
-        <w:t xml:space="preserve">             Similarity search</w:t>
-      </w:r>
-    </w:p>
-    <w:p>
-      <w:r>
-        <w:t xml:space="preserve">                      │</w:t>
-      </w:r>
-    </w:p>
-    <w:p>
-      <w:r>
-        <w:t xml:space="preserve">                      </w:t>
-      </w:r>
-      <w:r>
-        <w:rPr>
-          <w:rFonts w:ascii="Arial" w:hAnsi="Arial" w:cs="Arial"/>
-        </w:rPr>
-        <w:t>▼</w:t>
-      </w:r>
-    </w:p>
-    <w:p>
-      <w:r>
-        <w:t xml:space="preserve">          Retrieve relevant chunks</w:t>
-      </w:r>
-    </w:p>
-    <w:p>
-      <w:r>
-        <w:t xml:space="preserve">                      │</w:t>
-      </w:r>
-    </w:p>
-    <w:p>
-      <w:r>
-        <w:t xml:space="preserve">                      </w:t>
-      </w:r>
-      <w:r>
-        <w:rPr>
-          <w:rFonts w:ascii="Arial" w:hAnsi="Arial" w:cs="Arial"/>
-        </w:rPr>
-        <w:t>▼</w:t>
-      </w:r>
-    </w:p>
-    <w:p>
-      <w:r>
-        <w:t xml:space="preserve">              Send context + query</w:t>
-      </w:r>
-    </w:p>
-    <w:p>
-      <w:r>
-        <w:t xml:space="preserve">                    to LLM</w:t>
-      </w:r>
-    </w:p>
-    <w:p>
-      <w:r>
-        <w:t xml:space="preserve">                      │</w:t>
-      </w:r>
-    </w:p>
-    <w:p>
-      <w:r>
-        <w:t xml:space="preserve">                      </w:t>
-      </w:r>
-      <w:r>
-        <w:rPr>
-          <w:rFonts w:ascii="Arial" w:hAnsi="Arial" w:cs="Arial"/>
-        </w:rPr>
-        <w:t>▼</w:t>
-      </w:r>
-    </w:p>
-    <w:p>
-      <w:r>
-        <w:t xml:space="preserve">              Grounded AI answer</w:t>
-      </w:r>
-    </w:p>
-    <w:p>
-      <w:r>
-        <w:t xml:space="preserve">                      │</w:t>
-      </w:r>
-    </w:p>
-    <w:p>
-      <w:r>
-        <w:t xml:space="preserve">                      </w:t>
-      </w:r>
-      <w:r>
-        <w:rPr>
-          <w:rFonts w:ascii="Arial" w:hAnsi="Arial" w:cs="Arial"/>
-        </w:rPr>
-        <w:t>▼</w:t>
-      </w:r>
-    </w:p>
-    <w:p>
-      <w:r>
-        <w:t xml:space="preserve">             Show source context</w:t>
-      </w:r>
-    </w:p>
-    <w:p>
-      <w:r>
         <w:t>That's directly aligned with the Intermediate requirements: embeddings, vector/similarity retrieval, grounded answers, and supporting context.</w:t>
       </w:r>
     </w:p>
@@ -1051,177 +1127,177 @@
     </w:p>
     <w:p>
       <w:r>
+        <w:t xml:space="preserve">You </w:t>
+      </w:r>
+      <w:r>
+        <w:rPr>
+          <w:b/>
+          <w:bCs/>
+        </w:rPr>
+        <w:t>don't have to memorize code</w:t>
+      </w:r>
+      <w:r>
+        <w:t>.</w:t>
+      </w:r>
+    </w:p>
+    <w:p>
+      <w:r>
+        <w:t>When we're finished, I'll give you something like:</w:t>
+      </w:r>
+    </w:p>
+    <w:p>
+      <w:pPr>
+        <w:rPr>
+          <w:b/>
+          <w:bCs/>
+        </w:rPr>
+      </w:pPr>
+      <w:r>
+        <w:rPr>
+          <w:b/>
+          <w:bCs/>
+        </w:rPr>
+        <w:t>DocuMind explanation</w:t>
+      </w:r>
+    </w:p>
+    <w:p>
+      <w:r>
+        <w:rPr>
+          <w:b/>
+          <w:bCs/>
+        </w:rPr>
+        <w:t>Problem:</w:t>
+      </w:r>
+    </w:p>
+    <w:p>
+      <w:r>
+        <w:t>Users often need to find answers inside long documents.</w:t>
+      </w:r>
+    </w:p>
+    <w:p>
+      <w:r>
+        <w:rPr>
+          <w:b/>
+          <w:bCs/>
+        </w:rPr>
+        <w:t>Solution:</w:t>
+      </w:r>
+    </w:p>
+    <w:p>
+      <w:r>
+        <w:t>DocuMind lets users upload documents and ask questions based specifically on those documents.</w:t>
+      </w:r>
+    </w:p>
+    <w:p>
+      <w:r>
+        <w:rPr>
+          <w:b/>
+          <w:bCs/>
+        </w:rPr>
+        <w:t>Pipeline:</w:t>
+      </w:r>
+    </w:p>
+    <w:p>
+      <w:r>
+        <w:t>Upload → Extract → Chunk → Embed → Retrieve → Generate → Show sources.</w:t>
+      </w:r>
+    </w:p>
+    <w:p>
+      <w:r>
+        <w:rPr>
+          <w:b/>
+          <w:bCs/>
+        </w:rPr>
+        <w:t>Chunking:</w:t>
+      </w:r>
+    </w:p>
+    <w:p>
+      <w:r>
+        <w:t>1000-character chunks with 200-character overlap.</w:t>
+      </w:r>
+    </w:p>
+    <w:p>
+      <w:r>
+        <w:rPr>
+          <w:b/>
+          <w:bCs/>
+        </w:rPr>
+        <w:t>Embeddings:</w:t>
+      </w:r>
+    </w:p>
+    <w:p>
+      <w:r>
+        <w:t>Convert text chunks and questions into numerical representations so we can compare their semantic similarity.</w:t>
+      </w:r>
+    </w:p>
+    <w:p>
+      <w:r>
+        <w:rPr>
+          <w:b/>
+          <w:bCs/>
+        </w:rPr>
+        <w:t>Retrieval:</w:t>
+      </w:r>
+    </w:p>
+    <w:p>
+      <w:r>
+        <w:t>Find the document chunks most relevant to the user's question.</w:t>
+      </w:r>
+    </w:p>
+    <w:p>
+      <w:r>
+        <w:rPr>
+          <w:b/>
+          <w:bCs/>
+        </w:rPr>
+        <w:t>Grounding:</w:t>
+      </w:r>
+    </w:p>
+    <w:p>
+      <w:r>
+        <w:t>Give the retrieved chunks to the language model as context so the answer is based on the uploaded document rather than just general model knowledge.</w:t>
+      </w:r>
+    </w:p>
+    <w:p>
+      <w:r>
+        <w:rPr>
+          <w:b/>
+          <w:bCs/>
+        </w:rPr>
+        <w:t>Sources:</w:t>
+      </w:r>
+    </w:p>
+    <w:p>
+      <w:r>
+        <w:t>Display the retrieved chunks so the user can see what information supported the answer.</w:t>
+      </w:r>
+    </w:p>
+    <w:p>
+      <w:r>
+        <w:rPr>
+          <w:b/>
+          <w:bCs/>
+        </w:rPr>
+        <w:t>Validation:</w:t>
+      </w:r>
+    </w:p>
+    <w:p>
+      <w:r>
+        <w:t>Handle unsupported files, empty documents, and empty questions.</w:t>
+      </w:r>
+    </w:p>
+    <w:p>
+      <w:r>
+        <w:rPr>
+          <w:b/>
+          <w:bCs/>
+        </w:rPr>
+        <w:t>Testing:</w:t>
+      </w:r>
+    </w:p>
+    <w:p>
+      <w:r>
         <w:lastRenderedPageBreak/>
-        <w:t xml:space="preserve">You </w:t>
-      </w:r>
-      <w:r>
-        <w:rPr>
-          <w:b/>
-          <w:bCs/>
-        </w:rPr>
-        <w:t>don't have to memorize code</w:t>
-      </w:r>
-      <w:r>
-        <w:t>.</w:t>
-      </w:r>
-    </w:p>
-    <w:p>
-      <w:r>
-        <w:t>When we're finished, I'll give you something like:</w:t>
-      </w:r>
-    </w:p>
-    <w:p>
-      <w:pPr>
-        <w:rPr>
-          <w:b/>
-          <w:bCs/>
-        </w:rPr>
-      </w:pPr>
-      <w:r>
-        <w:rPr>
-          <w:b/>
-          <w:bCs/>
-        </w:rPr>
-        <w:t>DocuMind explanation</w:t>
-      </w:r>
-    </w:p>
-    <w:p>
-      <w:r>
-        <w:rPr>
-          <w:b/>
-          <w:bCs/>
-        </w:rPr>
-        <w:t>Problem:</w:t>
-      </w:r>
-    </w:p>
-    <w:p>
-      <w:r>
-        <w:t>Users often need to find answers inside long documents.</w:t>
-      </w:r>
-    </w:p>
-    <w:p>
-      <w:r>
-        <w:rPr>
-          <w:b/>
-          <w:bCs/>
-        </w:rPr>
-        <w:t>Solution:</w:t>
-      </w:r>
-    </w:p>
-    <w:p>
-      <w:r>
-        <w:t>DocuMind lets users upload documents and ask questions based specifically on those documents.</w:t>
-      </w:r>
-    </w:p>
-    <w:p>
-      <w:r>
-        <w:rPr>
-          <w:b/>
-          <w:bCs/>
-        </w:rPr>
-        <w:t>Pipeline:</w:t>
-      </w:r>
-    </w:p>
-    <w:p>
-      <w:r>
-        <w:t>Upload → Extract → Chunk → Embed → Retrieve → Generate → Show sources.</w:t>
-      </w:r>
-    </w:p>
-    <w:p>
-      <w:r>
-        <w:rPr>
-          <w:b/>
-          <w:bCs/>
-        </w:rPr>
-        <w:t>Chunking:</w:t>
-      </w:r>
-    </w:p>
-    <w:p>
-      <w:r>
-        <w:t>1000-character chunks with 200-character overlap.</w:t>
-      </w:r>
-    </w:p>
-    <w:p>
-      <w:r>
-        <w:rPr>
-          <w:b/>
-          <w:bCs/>
-        </w:rPr>
-        <w:t>Embeddings:</w:t>
-      </w:r>
-    </w:p>
-    <w:p>
-      <w:r>
-        <w:t>Convert text chunks and questions into numerical representations so we can compare their semantic similarity.</w:t>
-      </w:r>
-    </w:p>
-    <w:p>
-      <w:r>
-        <w:rPr>
-          <w:b/>
-          <w:bCs/>
-        </w:rPr>
-        <w:t>Retrieval:</w:t>
-      </w:r>
-    </w:p>
-    <w:p>
-      <w:r>
-        <w:t>Find the document chunks most relevant to the user's question.</w:t>
-      </w:r>
-    </w:p>
-    <w:p>
-      <w:r>
-        <w:rPr>
-          <w:b/>
-          <w:bCs/>
-        </w:rPr>
-        <w:t>Grounding:</w:t>
-      </w:r>
-    </w:p>
-    <w:p>
-      <w:r>
-        <w:t>Give the retrieved chunks to the language model as context so the answer is based on the uploaded document rather than just general model knowledge.</w:t>
-      </w:r>
-    </w:p>
-    <w:p>
-      <w:r>
-        <w:rPr>
-          <w:b/>
-          <w:bCs/>
-        </w:rPr>
-        <w:t>Sources:</w:t>
-      </w:r>
-    </w:p>
-    <w:p>
-      <w:r>
-        <w:t>Display the retrieved chunks so the user can see what information supported the answer.</w:t>
-      </w:r>
-    </w:p>
-    <w:p>
-      <w:r>
-        <w:rPr>
-          <w:b/>
-          <w:bCs/>
-        </w:rPr>
-        <w:t>Validation:</w:t>
-      </w:r>
-    </w:p>
-    <w:p>
-      <w:r>
-        <w:t>Handle unsupported files, empty documents, and empty questions.</w:t>
-      </w:r>
-    </w:p>
-    <w:p>
-      <w:r>
-        <w:rPr>
-          <w:b/>
-          <w:bCs/>
-        </w:rPr>
-        <w:t>Testing:</w:t>
-      </w:r>
-    </w:p>
-    <w:p>
-      <w:r>
         <w:t>Test with both TXT and PDF documents.</w:t>
       </w:r>
     </w:p>
@@ -1273,7 +1349,6 @@
           <w:b/>
           <w:bCs/>
         </w:rPr>
-        <w:lastRenderedPageBreak/>
         <w:t>WHAT we changed → WHY we changed it → WHAT you can say about it in your video.</w:t>
       </w:r>
     </w:p>
@@ -1512,6 +1587,7 @@
     </w:p>
     <w:p>
       <w:r>
+        <w:lastRenderedPageBreak/>
         <w:t>For retrieval, overlap can help prevent an important sentence from being cut exactly at a chunk boundary.</w:t>
       </w:r>
     </w:p>
@@ -1557,231 +1633,231 @@
     </w:p>
     <w:p>
       <w:r>
+        <w:t>Our architecture can be:</w:t>
+      </w:r>
+    </w:p>
+    <w:p>
+      <w:r>
+        <w:t xml:space="preserve">                 DOCUMENT</w:t>
+      </w:r>
+    </w:p>
+    <w:p>
+      <w:r>
+        <w:t xml:space="preserve">                    ↓</w:t>
+      </w:r>
+    </w:p>
+    <w:p>
+      <w:r>
+        <w:t xml:space="preserve">              Extract text</w:t>
+      </w:r>
+    </w:p>
+    <w:p>
+      <w:r>
+        <w:t xml:space="preserve">                    ↓</w:t>
+      </w:r>
+    </w:p>
+    <w:p>
+      <w:r>
+        <w:t xml:space="preserve">                 Chunk</w:t>
+      </w:r>
+    </w:p>
+    <w:p>
+      <w:r>
+        <w:t xml:space="preserve">                    ↓</w:t>
+      </w:r>
+    </w:p>
+    <w:p>
+      <w:r>
+        <w:t xml:space="preserve">       ┌────────────</w:t>
+      </w:r>
+      <w:r>
+        <w:rPr>
+          <w:rFonts w:ascii="MS Gothic" w:eastAsia="MS Gothic" w:hAnsi="MS Gothic" w:cs="MS Gothic" w:hint="eastAsia"/>
+        </w:rPr>
+        <w:t>┴</w:t>
+      </w:r>
+      <w:r>
+        <w:rPr>
+          <w:rFonts w:ascii="Calibri" w:hAnsi="Calibri" w:cs="Calibri"/>
+        </w:rPr>
+        <w:t>────────────┐</w:t>
+      </w:r>
+    </w:p>
+    <w:p>
+      <w:r>
+        <w:t xml:space="preserve">       ↓                         ↓</w:t>
+      </w:r>
+    </w:p>
+    <w:p>
+      <w:r>
+        <w:t>Internal retrieval          User interface</w:t>
+      </w:r>
+    </w:p>
+    <w:p>
+      <w:r>
+        <w:t xml:space="preserve">       ↓                         ↓</w:t>
+      </w:r>
+    </w:p>
+    <w:p>
+      <w:r>
+        <w:t>overlap preserved          clean context display</w:t>
+      </w:r>
+    </w:p>
+    <w:p>
+      <w:r>
+        <w:t xml:space="preserve">       ↓</w:t>
+      </w:r>
+    </w:p>
+    <w:p>
+      <w:r>
+        <w:t>Embeddings</w:t>
+      </w:r>
+    </w:p>
+    <w:p>
+      <w:r>
+        <w:t xml:space="preserve">       ↓</w:t>
+      </w:r>
+    </w:p>
+    <w:p>
+      <w:r>
+        <w:t>Similarity search</w:t>
+      </w:r>
+    </w:p>
+    <w:p>
+      <w:pPr>
+        <w:rPr>
+          <w:b/>
+          <w:bCs/>
+          <w:highlight w:val="yellow"/>
+        </w:rPr>
+      </w:pPr>
+      <w:r>
+        <w:rPr>
+          <w:b/>
+          <w:bCs/>
+          <w:highlight w:val="yellow"/>
+        </w:rPr>
+        <w:t>Your project notes</w:t>
+      </w:r>
+    </w:p>
+    <w:p>
+      <w:pPr>
+        <w:rPr>
+          <w:highlight w:val="yellow"/>
+        </w:rPr>
+      </w:pPr>
+      <w:r>
+        <w:rPr>
+          <w:b/>
+          <w:bCs/>
+          <w:highlight w:val="yellow"/>
+        </w:rPr>
+        <w:t>Change:</w:t>
+      </w:r>
+      <w:r>
+        <w:rPr>
+          <w:highlight w:val="yellow"/>
+        </w:rPr>
+        <w:t xml:space="preserve"> Improved the chunking algorithm.</w:t>
+      </w:r>
+    </w:p>
+    <w:p>
+      <w:pPr>
+        <w:rPr>
+          <w:highlight w:val="yellow"/>
+        </w:rPr>
+      </w:pPr>
+      <w:r>
+        <w:rPr>
+          <w:b/>
+          <w:bCs/>
+          <w:highlight w:val="yellow"/>
+        </w:rPr>
+        <w:t>What:</w:t>
+      </w:r>
+      <w:r>
+        <w:rPr>
+          <w:highlight w:val="yellow"/>
+        </w:rPr>
+        <w:t xml:space="preserve"> Chunks now end and start at word boundaries while maintaining a 200-character overlap.</w:t>
+      </w:r>
+    </w:p>
+    <w:p>
+      <w:pPr>
+        <w:rPr>
+          <w:highlight w:val="yellow"/>
+        </w:rPr>
+      </w:pPr>
+      <w:r>
+        <w:rPr>
+          <w:b/>
+          <w:bCs/>
+          <w:highlight w:val="yellow"/>
+        </w:rPr>
+        <w:t>Why:</w:t>
+      </w:r>
+      <w:r>
+        <w:rPr>
+          <w:highlight w:val="yellow"/>
+        </w:rPr>
+        <w:t xml:space="preserve"> Prevent broken words and preserve contextual information between chunks.</w:t>
+      </w:r>
+    </w:p>
+    <w:p>
+      <w:pPr>
+        <w:rPr>
+          <w:highlight w:val="yellow"/>
+        </w:rPr>
+      </w:pPr>
+      <w:r>
+        <w:rPr>
+          <w:b/>
+          <w:bCs/>
+          <w:highlight w:val="yellow"/>
+        </w:rPr>
+        <w:t>Next:</w:t>
+      </w:r>
+      <w:r>
+        <w:rPr>
+          <w:highlight w:val="yellow"/>
+        </w:rPr>
+        <w:t xml:space="preserve"> Build </w:t>
+      </w:r>
+      <w:r>
+        <w:rPr>
+          <w:b/>
+          <w:bCs/>
+          <w:highlight w:val="yellow"/>
+        </w:rPr>
+        <w:t>embeddings</w:t>
+      </w:r>
+      <w:r>
+        <w:rPr>
+          <w:highlight w:val="yellow"/>
+        </w:rPr>
+        <w:t xml:space="preserve"> so these chunks can be converted into vectors and searched semantically.</w:t>
+      </w:r>
+    </w:p>
+    <w:p>
+      <w:r>
+        <w:rPr>
+          <w:highlight w:val="yellow"/>
+        </w:rPr>
         <w:lastRenderedPageBreak/>
-        <w:t>Our architecture can be:</w:t>
-      </w:r>
-    </w:p>
-    <w:p>
-      <w:r>
-        <w:t xml:space="preserve">                 DOCUMENT</w:t>
-      </w:r>
-    </w:p>
-    <w:p>
-      <w:r>
-        <w:t xml:space="preserve">                    ↓</w:t>
-      </w:r>
-    </w:p>
-    <w:p>
-      <w:r>
-        <w:t xml:space="preserve">              Extract text</w:t>
-      </w:r>
-    </w:p>
-    <w:p>
-      <w:r>
-        <w:t xml:space="preserve">                    ↓</w:t>
-      </w:r>
-    </w:p>
-    <w:p>
-      <w:r>
-        <w:t xml:space="preserve">                 Chunk</w:t>
-      </w:r>
-    </w:p>
-    <w:p>
-      <w:r>
-        <w:t xml:space="preserve">                    ↓</w:t>
-      </w:r>
-    </w:p>
-    <w:p>
-      <w:r>
-        <w:t xml:space="preserve">       ┌────────────</w:t>
-      </w:r>
-      <w:r>
-        <w:rPr>
-          <w:rFonts w:ascii="MS Gothic" w:eastAsia="MS Gothic" w:hAnsi="MS Gothic" w:cs="MS Gothic" w:hint="eastAsia"/>
-        </w:rPr>
-        <w:t>┴</w:t>
-      </w:r>
-      <w:r>
-        <w:rPr>
-          <w:rFonts w:ascii="Calibri" w:hAnsi="Calibri" w:cs="Calibri"/>
-        </w:rPr>
-        <w:t>────────────┐</w:t>
-      </w:r>
-    </w:p>
-    <w:p>
-      <w:r>
-        <w:t xml:space="preserve">       ↓                         ↓</w:t>
-      </w:r>
-    </w:p>
-    <w:p>
-      <w:r>
-        <w:t>Internal retrieval          User interface</w:t>
-      </w:r>
-    </w:p>
-    <w:p>
-      <w:r>
-        <w:t xml:space="preserve">       ↓                         ↓</w:t>
-      </w:r>
-    </w:p>
-    <w:p>
-      <w:r>
-        <w:t>overlap preserved          clean context display</w:t>
-      </w:r>
-    </w:p>
-    <w:p>
-      <w:r>
-        <w:t xml:space="preserve">       ↓</w:t>
-      </w:r>
-    </w:p>
-    <w:p>
-      <w:r>
-        <w:t>Embeddings</w:t>
-      </w:r>
-    </w:p>
-    <w:p>
-      <w:r>
-        <w:t xml:space="preserve">       ↓</w:t>
-      </w:r>
-    </w:p>
-    <w:p>
-      <w:r>
-        <w:t>Similarity search</w:t>
-      </w:r>
-    </w:p>
-    <w:p>
-      <w:pPr>
+        <w:t xml:space="preserve">Once you've saved this, </w:t>
+      </w:r>
+      <w:r>
         <w:rPr>
           <w:b/>
           <w:bCs/>
           <w:highlight w:val="yellow"/>
         </w:rPr>
-      </w:pPr>
-      <w:r>
-        <w:rPr>
-          <w:b/>
-          <w:bCs/>
+        <w:t>don't change anything else yet</w:t>
+      </w:r>
+      <w:r>
+        <w:rPr>
           <w:highlight w:val="yellow"/>
         </w:rPr>
-        <w:t>Your project notes</w:t>
-      </w:r>
-    </w:p>
-    <w:p>
-      <w:pPr>
-        <w:rPr>
-          <w:highlight w:val="yellow"/>
-        </w:rPr>
-      </w:pPr>
-      <w:r>
-        <w:rPr>
-          <w:b/>
-          <w:bCs/>
-          <w:highlight w:val="yellow"/>
-        </w:rPr>
-        <w:t>Change:</w:t>
-      </w:r>
-      <w:r>
-        <w:rPr>
-          <w:highlight w:val="yellow"/>
-        </w:rPr>
-        <w:t xml:space="preserve"> Improved the chunking algorithm.</w:t>
-      </w:r>
-    </w:p>
-    <w:p>
-      <w:pPr>
-        <w:rPr>
-          <w:highlight w:val="yellow"/>
-        </w:rPr>
-      </w:pPr>
-      <w:r>
-        <w:rPr>
-          <w:b/>
-          <w:bCs/>
-          <w:highlight w:val="yellow"/>
-        </w:rPr>
-        <w:t>What:</w:t>
-      </w:r>
-      <w:r>
-        <w:rPr>
-          <w:highlight w:val="yellow"/>
-        </w:rPr>
-        <w:t xml:space="preserve"> Chunks now end and start at word boundaries while maintaining a 200-character overlap.</w:t>
-      </w:r>
-    </w:p>
-    <w:p>
-      <w:pPr>
-        <w:rPr>
-          <w:highlight w:val="yellow"/>
-        </w:rPr>
-      </w:pPr>
-      <w:r>
-        <w:rPr>
-          <w:b/>
-          <w:bCs/>
-          <w:highlight w:val="yellow"/>
-        </w:rPr>
-        <w:t>Why:</w:t>
-      </w:r>
-      <w:r>
-        <w:rPr>
-          <w:highlight w:val="yellow"/>
-        </w:rPr>
-        <w:t xml:space="preserve"> Prevent broken words and preserve contextual information between chunks.</w:t>
-      </w:r>
-    </w:p>
-    <w:p>
-      <w:pPr>
-        <w:rPr>
-          <w:highlight w:val="yellow"/>
-        </w:rPr>
-      </w:pPr>
-      <w:r>
-        <w:rPr>
-          <w:b/>
-          <w:bCs/>
-          <w:highlight w:val="yellow"/>
-        </w:rPr>
-        <w:t>Next:</w:t>
-      </w:r>
-      <w:r>
-        <w:rPr>
-          <w:highlight w:val="yellow"/>
-        </w:rPr>
-        <w:t xml:space="preserve"> Build </w:t>
-      </w:r>
-      <w:r>
-        <w:rPr>
-          <w:b/>
-          <w:bCs/>
-          <w:highlight w:val="yellow"/>
-        </w:rPr>
-        <w:t>embeddings</w:t>
-      </w:r>
-      <w:r>
-        <w:rPr>
-          <w:highlight w:val="yellow"/>
-        </w:rPr>
-        <w:t xml:space="preserve"> so these chunks can be converted into vectors and searched semantically.</w:t>
-      </w:r>
-    </w:p>
-    <w:p>
-      <w:r>
-        <w:rPr>
-          <w:highlight w:val="yellow"/>
-        </w:rPr>
-        <w:t xml:space="preserve">Once you've saved this, </w:t>
-      </w:r>
-      <w:r>
-        <w:rPr>
-          <w:b/>
-          <w:bCs/>
-          <w:highlight w:val="yellow"/>
-        </w:rPr>
-        <w:t>don't change anything else yet</w:t>
-      </w:r>
-      <w:r>
-        <w:rPr>
-          <w:highlight w:val="yellow"/>
-        </w:rPr>
         <w:t>. Tell me what you see when you upload the PDF again.</w:t>
       </w:r>
     </w:p>
@@ -1821,7 +1897,6 @@
           <w:b/>
           <w:bCs/>
         </w:rPr>
-        <w:lastRenderedPageBreak/>
         <w:t>Upload → Extract → Chunk → Embeddings → Similarity Retrieval → Grounded Answer → Show Retrieved Context → Validation</w:t>
       </w:r>
     </w:p>
@@ -2449,6 +2524,7 @@
           </w:tcPr>
           <w:p>
             <w:r>
+              <w:lastRenderedPageBreak/>
               <w:t>Error handling</w:t>
             </w:r>
           </w:p>
@@ -2547,7 +2623,6 @@
     </w:p>
     <w:p>
       <w:r>
-        <w:lastRenderedPageBreak/>
         <w:pict w14:anchorId="414CD087">
           <v:rect id="_x0000_i1032" style="width:0;height:1.5pt" o:hralign="center" o:hrstd="t" o:hr="t" fillcolor="#a0a0a0" stroked="f"/>
         </w:pict>
@@ -2696,6 +2771,7 @@
     </w:p>
     <w:p>
       <w:r>
+        <w:lastRenderedPageBreak/>
         <w:t>src/utils/embeddings.ts</w:t>
       </w:r>
     </w:p>
@@ -2738,7 +2814,6 @@
     </w:p>
     <w:p>
       <w:r>
-        <w:lastRenderedPageBreak/>
         <w:pict w14:anchorId="15D53971">
           <v:rect id="_x0000_i1035" style="width:0;height:1.5pt" o:hralign="center" o:hrstd="t" o:hr="t" fillcolor="#a0a0a0" stroked="f"/>
         </w:pict>
@@ -2861,6 +2936,7 @@
     </w:p>
     <w:p>
       <w:r>
+        <w:lastRenderedPageBreak/>
         <w:t>The system should retrieve:</w:t>
       </w:r>
     </w:p>
@@ -2907,7 +2983,6 @@
     </w:p>
     <w:p>
       <w:r>
-        <w:lastRenderedPageBreak/>
         <w:t>We'll modify App.tsx so after uploading a document, the UI becomes:</w:t>
       </w:r>
     </w:p>
@@ -3040,6 +3115,7 @@
     </w:p>
     <w:p>
       <w:r>
+        <w:lastRenderedPageBreak/>
         <w:t>Generate question embedding</w:t>
       </w:r>
     </w:p>
@@ -3070,7 +3146,6 @@
     </w:p>
     <w:p>
       <w:r>
-        <w:lastRenderedPageBreak/>
         <w:t>Retrieve top relevant chunks</w:t>
       </w:r>
     </w:p>
@@ -3197,6 +3272,7 @@
     </w:p>
     <w:p>
       <w:r>
+        <w:lastRenderedPageBreak/>
         <w:t>we have:</w:t>
       </w:r>
     </w:p>
@@ -3227,7 +3303,6 @@
     </w:p>
     <w:p>
       <w:r>
-        <w:lastRenderedPageBreak/>
         <w:t xml:space="preserve">   ↓</w:t>
       </w:r>
     </w:p>
@@ -3337,6 +3412,7 @@
     </w:p>
     <w:p>
       <w:r>
+        <w:lastRenderedPageBreak/>
         <w:t>And it makes your project look much more like an actual RAG application.</w:t>
       </w:r>
     </w:p>
@@ -3399,7 +3475,6 @@
           <w:b/>
           <w:bCs/>
         </w:rPr>
-        <w:lastRenderedPageBreak/>
         <w:t>Empty question</w:t>
       </w:r>
     </w:p>
@@ -3580,6 +3655,7 @@
     </w:p>
     <w:p>
       <w:r>
+        <w:lastRenderedPageBreak/>
         <w:t>git status</w:t>
       </w:r>
     </w:p>
@@ -3629,98 +3705,158 @@
           <w:b/>
           <w:bCs/>
         </w:rPr>
+        <w:t>STEP 12 — REPORT</w:t>
+      </w:r>
+    </w:p>
+    <w:p>
+      <w:r>
+        <w:t>Then we stop coding.</w:t>
+      </w:r>
+    </w:p>
+    <w:p>
+      <w:r>
+        <w:t>We'll make your report around:</w:t>
+      </w:r>
+    </w:p>
+    <w:p>
+      <w:pPr>
+        <w:rPr>
+          <w:b/>
+          <w:bCs/>
+        </w:rPr>
+      </w:pPr>
+      <w:r>
+        <w:rPr>
+          <w:b/>
+          <w:bCs/>
+        </w:rPr>
+        <w:t>1. Introduction</w:t>
+      </w:r>
+    </w:p>
+    <w:p>
+      <w:r>
+        <w:t>What DocuMind AI is.</w:t>
+      </w:r>
+    </w:p>
+    <w:p>
+      <w:pPr>
+        <w:rPr>
+          <w:b/>
+          <w:bCs/>
+        </w:rPr>
+      </w:pPr>
+      <w:r>
+        <w:rPr>
+          <w:b/>
+          <w:bCs/>
+        </w:rPr>
+        <w:t>2. Objective</w:t>
+      </w:r>
+    </w:p>
+    <w:p>
+      <w:r>
+        <w:t>Build a document-based question-answering system.</w:t>
+      </w:r>
+    </w:p>
+    <w:p>
+      <w:pPr>
+        <w:rPr>
+          <w:b/>
+          <w:bCs/>
+        </w:rPr>
+      </w:pPr>
+      <w:r>
+        <w:rPr>
+          <w:b/>
+          <w:bCs/>
+        </w:rPr>
+        <w:t>3. Technologies</w:t>
+      </w:r>
+    </w:p>
+    <w:p>
+      <w:r>
+        <w:t>React, TypeScript, Vite, embedding model, similarity search, LLM API.</w:t>
+      </w:r>
+    </w:p>
+    <w:p>
+      <w:pPr>
+        <w:rPr>
+          <w:b/>
+          <w:bCs/>
+        </w:rPr>
+      </w:pPr>
+      <w:r>
+        <w:rPr>
+          <w:b/>
+          <w:bCs/>
+        </w:rPr>
+        <w:t>4. Architecture</w:t>
+      </w:r>
+    </w:p>
+    <w:p>
+      <w:r>
+        <w:t>Upload</w:t>
+      </w:r>
+    </w:p>
+    <w:p>
+      <w:r>
+        <w:t xml:space="preserve"> ↓</w:t>
+      </w:r>
+    </w:p>
+    <w:p>
+      <w:r>
+        <w:t>Extraction</w:t>
+      </w:r>
+    </w:p>
+    <w:p>
+      <w:r>
+        <w:t xml:space="preserve"> ↓</w:t>
+      </w:r>
+    </w:p>
+    <w:p>
+      <w:r>
+        <w:t>Chunking</w:t>
+      </w:r>
+    </w:p>
+    <w:p>
+      <w:r>
+        <w:t xml:space="preserve"> ↓</w:t>
+      </w:r>
+    </w:p>
+    <w:p>
+      <w:r>
+        <w:t>Embeddings</w:t>
+      </w:r>
+    </w:p>
+    <w:p>
+      <w:r>
+        <w:t xml:space="preserve"> ↓</w:t>
+      </w:r>
+    </w:p>
+    <w:p>
+      <w:r>
+        <w:t>Vector Search</w:t>
+      </w:r>
+    </w:p>
+    <w:p>
+      <w:r>
+        <w:t xml:space="preserve"> ↓</w:t>
+      </w:r>
+    </w:p>
+    <w:p>
+      <w:r>
+        <w:t>Relevant Context</w:t>
+      </w:r>
+    </w:p>
+    <w:p>
+      <w:r>
+        <w:t xml:space="preserve"> ↓</w:t>
+      </w:r>
+    </w:p>
+    <w:p>
+      <w:r>
         <w:lastRenderedPageBreak/>
-        <w:t>STEP 12 — REPORT</w:t>
-      </w:r>
-    </w:p>
-    <w:p>
-      <w:r>
-        <w:t>Then we stop coding.</w:t>
-      </w:r>
-    </w:p>
-    <w:p>
-      <w:r>
-        <w:t>We'll make your report around:</w:t>
-      </w:r>
-    </w:p>
-    <w:p>
-      <w:pPr>
-        <w:rPr>
-          <w:b/>
-          <w:bCs/>
-        </w:rPr>
-      </w:pPr>
-      <w:r>
-        <w:rPr>
-          <w:b/>
-          <w:bCs/>
-        </w:rPr>
-        <w:t>1. Introduction</w:t>
-      </w:r>
-    </w:p>
-    <w:p>
-      <w:r>
-        <w:t>What DocuMind AI is.</w:t>
-      </w:r>
-    </w:p>
-    <w:p>
-      <w:pPr>
-        <w:rPr>
-          <w:b/>
-          <w:bCs/>
-        </w:rPr>
-      </w:pPr>
-      <w:r>
-        <w:rPr>
-          <w:b/>
-          <w:bCs/>
-        </w:rPr>
-        <w:t>2. Objective</w:t>
-      </w:r>
-    </w:p>
-    <w:p>
-      <w:r>
-        <w:t>Build a document-based question-answering system.</w:t>
-      </w:r>
-    </w:p>
-    <w:p>
-      <w:pPr>
-        <w:rPr>
-          <w:b/>
-          <w:bCs/>
-        </w:rPr>
-      </w:pPr>
-      <w:r>
-        <w:rPr>
-          <w:b/>
-          <w:bCs/>
-        </w:rPr>
-        <w:t>3. Technologies</w:t>
-      </w:r>
-    </w:p>
-    <w:p>
-      <w:r>
-        <w:t>React, TypeScript, Vite, embedding model, similarity search, LLM API.</w:t>
-      </w:r>
-    </w:p>
-    <w:p>
-      <w:pPr>
-        <w:rPr>
-          <w:b/>
-          <w:bCs/>
-        </w:rPr>
-      </w:pPr>
-      <w:r>
-        <w:rPr>
-          <w:b/>
-          <w:bCs/>
-        </w:rPr>
-        <w:t>4. Architecture</w:t>
-      </w:r>
-    </w:p>
-    <w:p>
-      <w:r>
-        <w:t>Upload</w:t>
+        <w:t>LLM</w:t>
       </w:r>
     </w:p>
     <w:p>
@@ -3730,7 +3866,7 @@
     </w:p>
     <w:p>
       <w:r>
-        <w:t>Extraction</w:t>
+        <w:t>Grounded Answer</w:t>
       </w:r>
     </w:p>
     <w:p>
@@ -3740,66 +3876,6 @@
     </w:p>
     <w:p>
       <w:r>
-        <w:t>Chunking</w:t>
-      </w:r>
-    </w:p>
-    <w:p>
-      <w:r>
-        <w:t xml:space="preserve"> ↓</w:t>
-      </w:r>
-    </w:p>
-    <w:p>
-      <w:r>
-        <w:t>Embeddings</w:t>
-      </w:r>
-    </w:p>
-    <w:p>
-      <w:r>
-        <w:t xml:space="preserve"> ↓</w:t>
-      </w:r>
-    </w:p>
-    <w:p>
-      <w:r>
-        <w:t>Vector Search</w:t>
-      </w:r>
-    </w:p>
-    <w:p>
-      <w:r>
-        <w:t xml:space="preserve"> ↓</w:t>
-      </w:r>
-    </w:p>
-    <w:p>
-      <w:r>
-        <w:t>Relevant Context</w:t>
-      </w:r>
-    </w:p>
-    <w:p>
-      <w:r>
-        <w:t xml:space="preserve"> ↓</w:t>
-      </w:r>
-    </w:p>
-    <w:p>
-      <w:r>
-        <w:t>LLM</w:t>
-      </w:r>
-    </w:p>
-    <w:p>
-      <w:r>
-        <w:t xml:space="preserve"> ↓</w:t>
-      </w:r>
-    </w:p>
-    <w:p>
-      <w:r>
-        <w:t>Grounded Answer</w:t>
-      </w:r>
-    </w:p>
-    <w:p>
-      <w:r>
-        <w:t xml:space="preserve"> ↓</w:t>
-      </w:r>
-    </w:p>
-    <w:p>
-      <w:r>
         <w:t>Source Context</w:t>
       </w:r>
     </w:p>
@@ -3820,7 +3896,6 @@
     </w:p>
     <w:p>
       <w:r>
-        <w:lastRenderedPageBreak/>
         <w:t>Explain each component.</w:t>
       </w:r>
     </w:p>
@@ -4029,6 +4104,7 @@
     </w:p>
     <w:p>
       <w:r>
+        <w:lastRenderedPageBreak/>
         <w:t xml:space="preserve">Once it finishes, </w:t>
       </w:r>
       <w:r>
@@ -4050,6 +4126,11 @@
         <w:t>The system calculates cosine similarity between the query embedding and document-chunk embeddings and retrieves the top relevant chunks. Similarity scores are displayed to provide transparency into the retrieval process.”</w:t>
       </w:r>
     </w:p>
+    <w:p/>
+    <w:p/>
+    <w:p/>
+    <w:p/>
+    <w:p/>
     <w:sectPr>
       <w:pgSz w:w="11906" w:h="16838"/>
       <w:pgMar w:top="1440" w:right="1440" w:bottom="1440" w:left="1440" w:header="708" w:footer="708" w:gutter="0"/>

</xml_diff>